<commit_message>
Refresh feature docs for venue role, maps, featured venues, CV upload, guest fields, duration
Co-Authored-By: Claude Fable 5 <noreply@anthropic.com>
</commit_message>
<xml_diff>
--- a/docs/1-Prebooze-Guest-Site-Features.docx
+++ b/docs/1-Prebooze-Guest-Site-Features.docx
@@ -509,7 +509,7 @@
           <w:sz-cs w:val="24"/>
           <w:spacing w:val="0"/>
         </w:rPr>
-        <w:t xml:space="preserve">Featured strips inside their own sections (events / organizers / promoters / line-ups) — always labeled “Featured”, capped, admin-approved; organic ranking never overridden.</w:t>
+        <w:t xml:space="preserve">Featured strips inside their own sections (events / organizers / promoters / line-ups / venues) — always labeled “Featured”, capped, admin-approved; organic ranking never overridden.</w:t>
       </w:r>
     </w:p>
     <w:p>
@@ -706,7 +706,7 @@
           <w:sz-cs w:val="24"/>
           <w:spacing w:val="0"/>
         </w:rPr>
-        <w:t xml:space="preserve">Venue directory + venue detail pages (photos, amenities, upcoming events, favourite button).</w:t>
+        <w:t xml:space="preserve">Venue directory + venue detail pages: photos, amenities, separate Timings and About sections, live Google-Maps embed with a Get-directions button, upcoming events, favourite button.</w:t>
       </w:r>
     </w:p>
     <w:p>
@@ -773,7 +773,7 @@
           <w:sz-cs w:val="24"/>
           <w:spacing w:val="0"/>
         </w:rPr>
-        <w:t xml:space="preserve">Full event details: date/time, venue, ticket tiers with inclusions, line-up artists, event rules, dress code, food &amp; drinks, prohibited items, hosted-by section.</w:t>
+        <w:t xml:space="preserve">Full event details: date/time, venue (name links to the venue page), ticket tiers with inclusions, line-up artists, event rules, dress code, food &amp; drinks, prohibited items, hosted-by section.</w:t>
       </w:r>
     </w:p>
     <w:p>
@@ -918,7 +918,7 @@
           <w:sz-cs w:val="24"/>
           <w:spacing w:val="0"/>
         </w:rPr>
-        <w:t xml:space="preserve">Checkout: attendee details, coupon codes, Prebooze wallet credit, saved payment methods (default pre-selected), promoter-link attribution.</w:t>
+        <w:t xml:space="preserve">Checkout: attendee details (name + gender + WhatsApp number for every extra guest), coupon codes, Prebooze wallet credit, saved payment methods (default pre-selected), promoter-link attribution.</w:t>
       </w:r>
     </w:p>
     <w:p>
@@ -970,7 +970,7 @@
           <w:sz-cs w:val="24"/>
           <w:spacing w:val="0"/>
         </w:rPr>
-        <w:t xml:space="preserve">Ticket delivered on WhatsApp; downloadable as a designed PNG e-ticket; add-to-calendar (.ics).</w:t>
+        <w:t xml:space="preserve">Ticket delivered on WhatsApp; downloadable as a designed PNG e-ticket with the full numbered guest list; add-to-calendar (.ics).</w:t>
       </w:r>
     </w:p>
     <w:p>
@@ -1394,7 +1394,7 @@
           <w:sz-cs w:val="24"/>
           <w:spacing w:val="0"/>
         </w:rPr>
-        <w:t xml:space="preserve">Careers: open roles, single-block job description page with Job ID, apply form (applications visible in admin).</w:t>
+        <w:t xml:space="preserve">Careers: open roles, single-block job description page with Job ID, apply form with required CV/resume upload (applications visible in admin).</w:t>
       </w:r>
     </w:p>
     <w:p>
@@ -1650,7 +1650,7 @@
           <w:sz-cs w:val="24"/>
           <w:spacing w:val="0"/>
         </w:rPr>
-        <w:t xml:space="preserve"> — listing editor, events at the venue, verification status, settings.</w:t>
+        <w:t xml:space="preserve"> — listing editor with live map preview, events at the venue, get-featured, verification status, settings. Venue is a business-only account: booking, wishlist, wallet and referrals are disabled for it.</w:t>
       </w:r>
     </w:p>
     <w:p>

</xml_diff>